<commit_message>
Update handbook and roadmap for five plans and fundraising caps.
</commit_message>
<xml_diff>
--- a/技術開發手冊.docx
+++ b/技術開發手冊.docx
@@ -32,16 +32,16 @@
       </w:pPr>
       <w:r>
         <w:rPr/>
-        <w:t xml:space="preserve">文件日期：2026-08-28</w:t>
-      </w:r>
-    </w:p>
-    <w:p>
-      <w:pPr>
-        <w:spacing w:lineRule="auto"/>
-      </w:pPr>
-      <w:r>
-        <w:rPr/>
-        <w:t xml:space="preserve">對應規格：三層架構 v2.1（知遇卡／知音卡／知己卡）</w:t>
+        <w:t xml:space="preserve">文件日期：2026-08-29</w:t>
+      </w:r>
+    </w:p>
+    <w:p>
+      <w:pPr>
+        <w:spacing w:lineRule="auto"/>
+      </w:pPr>
+      <w:r>
+        <w:rPr/>
+        <w:t xml:space="preserve">對應規格：三層架構 v2.1（知遇卡／知音卡／知己卡）＋五項年度計畫與募集額滿</w:t>
       </w:r>
     </w:p>
     <w:p>
@@ -859,7 +859,23 @@
       </w:r>
       <w:r>
         <w:rPr/>
-        <w:t xml:space="preserve"> 後，正式站也應對齊同一份原始碼，避免 CLI 部署與 Git 部署互相覆蓋。</w:t>
+        <w:t xml:space="preserve"> 後，Vercel 會自動部署正式站。CLI </w:t>
+      </w:r>
+      <w:r>
+        <w:rPr/>
+        <w:t xml:space="preserve">vercel --prod --yes</w:t>
+      </w:r>
+      <w:r>
+        <w:rPr/>
+        <w:t xml:space="preserve"> 可用，但以 GitHub </w:t>
+      </w:r>
+      <w:r>
+        <w:rPr/>
+        <w:t xml:space="preserve">main</w:t>
+      </w:r>
+      <w:r>
+        <w:rPr/>
+        <w:t xml:space="preserve"> 為準，避免兩套部署互相覆蓋。</w:t>
       </w:r>
     </w:p>
     <w:p>
@@ -880,7 +896,7 @@
         <w:rPr>
           <w:rFonts w:ascii="Courier" w:hAnsi="Courier"/>
         </w:rPr>
-        <w:t xml:space="preserve">src/   main.tsx                 掛上 AppProvider   App.tsx                  依 screen 渲染單一畫面   index.css                品牌色、字體、panel／會員卡／票券樣式   types.ts                 領域型別（唯一來源）   context/AppContext.tsx   全域狀態與流程動作   data/mock.ts             卡別、計畫、附加禮遇、示範會員   lib/format.ts            年費、日期、券號、依模擬時間推導券狀態   screens/                 七個畫面   components/              共用 UI（頂欄、鎖定彈窗、提貨券、附加禮遇表、圖示）</w:t>
+        <w:t xml:space="preserve">src/   main.tsx                 掛上 AppProvider   App.tsx                  依 screen 渲染單一畫面   index.css                品牌色、字體、panel／會員卡／票券樣式   types.ts                 領域型別（唯一來源）   context/AppContext.tsx   全域狀態與流程動作   data/mock.ts             卡別、計畫、附加禮遇、示範會員   lib/format.ts            年費、萬元募集金額、日期、券號、依模擬時間推導券狀態   screens/                 七個畫面   components/              共用 UI（頂欄、鎖定彈窗、提貨券、附加禮遇表、圖示）</w:t>
       </w:r>
     </w:p>
     <w:p>
@@ -1576,6 +1592,23 @@
         <w:t xml:space="preserve">4.3 年度支持計畫</w:t>
       </w:r>
     </w:p>
+    <w:p>
+      <w:pPr>
+        <w:spacing w:lineRule="auto"/>
+      </w:pPr>
+      <w:r>
+        <w:rPr/>
+        <w:t xml:space="preserve">目前五項。募集數字為 Demo mock；</w:t>
+      </w:r>
+      <w:r>
+        <w:rPr/>
+        <w:t xml:space="preserve">concert</w:t>
+      </w:r>
+      <w:r>
+        <w:rPr/>
+        <w:t xml:space="preserve"> 刻意設為額滿，用來示範「停止募集」。</w:t>
+      </w:r>
+    </w:p>
     <w:tbl>
       <w:tblPr>
         <w:tblBorders>
@@ -1594,10 +1627,12 @@
         <w:jc w:val="center"/>
       </w:tblPr>
       <w:tblGrid>
-        <w:gridCol w:w="2520"/>
-        <w:gridCol w:w="2520"/>
-        <w:gridCol w:w="2520"/>
-        <w:gridCol w:w="2520"/>
+        <w:gridCol w:w="1680"/>
+        <w:gridCol w:w="1680"/>
+        <w:gridCol w:w="1680"/>
+        <w:gridCol w:w="1680"/>
+        <w:gridCol w:w="1680"/>
+        <w:gridCol w:w="1680"/>
       </w:tblGrid>
       <w:tr>
         <w:trPr>
@@ -1679,12 +1714,52 @@
             </w:r>
           </w:p>
         </w:tc>
+        <w:tc>
+          <w:tcPr>
+            <w:tcBorders>
+              <w:top w:val="single" w:sz="1" w:space="0" w:color="000000"/>
+              <w:bottom w:val="single" w:sz="1" w:space="0" w:color="000000"/>
+              <w:left w:val="single" w:sz="1" w:space="0" w:color="000000"/>
+              <w:right w:val="single" w:sz="1" w:space="0" w:color="000000"/>
+            </w:tcBorders>
+          </w:tcPr>
+          <w:p>
+            <w:pPr>
+              <w:spacing w:lineRule="auto"/>
+            </w:pPr>
+            <w:r>
+              <w:rPr/>
+              <w:t xml:space="preserve">目標</w:t>
+            </w:r>
+          </w:p>
+        </w:tc>
+        <w:tc>
+          <w:tcPr>
+            <w:tcBorders>
+              <w:top w:val="single" w:sz="1" w:space="0" w:color="000000"/>
+              <w:bottom w:val="single" w:sz="1" w:space="0" w:color="000000"/>
+              <w:left w:val="single" w:sz="1" w:space="0" w:color="000000"/>
+              <w:right w:val="single" w:sz="1" w:space="0" w:color="000000"/>
+            </w:tcBorders>
+          </w:tcPr>
+          <w:p>
+            <w:pPr>
+              <w:spacing w:lineRule="auto"/>
+            </w:pPr>
+            <w:r>
+              <w:rPr/>
+              <w:t xml:space="preserve">Demo 已募</w:t>
+            </w:r>
+          </w:p>
+        </w:tc>
       </w:tr>
       <w:tblGrid>
-        <w:gridCol w:w="2520"/>
-        <w:gridCol w:w="2520"/>
-        <w:gridCol w:w="2520"/>
-        <w:gridCol w:w="2520"/>
+        <w:gridCol w:w="1680"/>
+        <w:gridCol w:w="1680"/>
+        <w:gridCol w:w="1680"/>
+        <w:gridCol w:w="1680"/>
+        <w:gridCol w:w="1680"/>
+        <w:gridCol w:w="1680"/>
       </w:tblGrid>
       <w:tr>
         <w:trPr>
@@ -1768,6 +1843,44 @@
             </w:r>
           </w:p>
         </w:tc>
+        <w:tc>
+          <w:tcPr>
+            <w:tcBorders>
+              <w:top w:val="single" w:sz="1" w:space="0" w:color="000000"/>
+              <w:bottom w:val="single" w:sz="1" w:space="0" w:color="000000"/>
+              <w:left w:val="single" w:sz="1" w:space="0" w:color="000000"/>
+              <w:right w:val="single" w:sz="1" w:space="0" w:color="000000"/>
+            </w:tcBorders>
+          </w:tcPr>
+          <w:p>
+            <w:pPr>
+              <w:spacing w:lineRule="auto"/>
+            </w:pPr>
+            <w:r>
+              <w:rPr/>
+              <w:t xml:space="preserve">NT$20萬</w:t>
+            </w:r>
+          </w:p>
+        </w:tc>
+        <w:tc>
+          <w:tcPr>
+            <w:tcBorders>
+              <w:top w:val="single" w:sz="1" w:space="0" w:color="000000"/>
+              <w:bottom w:val="single" w:sz="1" w:space="0" w:color="000000"/>
+              <w:left w:val="single" w:sz="1" w:space="0" w:color="000000"/>
+              <w:right w:val="single" w:sz="1" w:space="0" w:color="000000"/>
+            </w:tcBorders>
+          </w:tcPr>
+          <w:p>
+            <w:pPr>
+              <w:spacing w:lineRule="auto"/>
+            </w:pPr>
+            <w:r>
+              <w:rPr/>
+              <w:t xml:space="preserve">12萬（60%）</w:t>
+            </w:r>
+          </w:p>
+        </w:tc>
       </w:tr>
       <w:tr>
         <w:trPr>
@@ -1851,6 +1964,64 @@
             </w:r>
           </w:p>
         </w:tc>
+        <w:tc>
+          <w:tcPr>
+            <w:tcBorders>
+              <w:top w:val="single" w:sz="1" w:space="0" w:color="000000"/>
+              <w:bottom w:val="single" w:sz="1" w:space="0" w:color="000000"/>
+              <w:left w:val="single" w:sz="1" w:space="0" w:color="000000"/>
+              <w:right w:val="single" w:sz="1" w:space="0" w:color="000000"/>
+            </w:tcBorders>
+          </w:tcPr>
+          <w:p>
+            <w:pPr>
+              <w:spacing w:lineRule="auto"/>
+            </w:pPr>
+            <w:r>
+              <w:rPr/>
+              <w:t xml:space="preserve">NT$100萬</w:t>
+            </w:r>
+          </w:p>
+        </w:tc>
+        <w:tc>
+          <w:tcPr>
+            <w:tcBorders>
+              <w:top w:val="single" w:sz="1" w:space="0" w:color="000000"/>
+              <w:bottom w:val="single" w:sz="1" w:space="0" w:color="000000"/>
+              <w:left w:val="single" w:sz="1" w:space="0" w:color="000000"/>
+              <w:right w:val="single" w:sz="1" w:space="0" w:color="000000"/>
+            </w:tcBorders>
+          </w:tcPr>
+          <w:p>
+            <w:pPr>
+              <w:spacing w:lineRule="auto"/>
+            </w:pPr>
+            <w:r>
+              <w:rPr/>
+              <w:t xml:space="preserve">100萬（</w:t>
+            </w:r>
+          </w:p>
+          <w:p>
+            <w:pPr>
+              <w:spacing w:lineRule="auto"/>
+            </w:pPr>
+            <w:r>
+              <w:rPr>
+                <w:b/>
+              </w:rPr>
+              <w:t xml:space="preserve">額滿</w:t>
+            </w:r>
+          </w:p>
+          <w:p>
+            <w:pPr>
+              <w:spacing w:lineRule="auto"/>
+            </w:pPr>
+            <w:r>
+              <w:rPr/>
+              <w:t xml:space="preserve">）</w:t>
+            </w:r>
+          </w:p>
+        </w:tc>
       </w:tr>
       <w:tr>
         <w:trPr>
@@ -1934,6 +2105,286 @@
             </w:r>
           </w:p>
         </w:tc>
+        <w:tc>
+          <w:tcPr>
+            <w:tcBorders>
+              <w:top w:val="single" w:sz="1" w:space="0" w:color="000000"/>
+              <w:bottom w:val="single" w:sz="1" w:space="0" w:color="000000"/>
+              <w:left w:val="single" w:sz="1" w:space="0" w:color="000000"/>
+              <w:right w:val="single" w:sz="1" w:space="0" w:color="000000"/>
+            </w:tcBorders>
+          </w:tcPr>
+          <w:p>
+            <w:pPr>
+              <w:spacing w:lineRule="auto"/>
+            </w:pPr>
+            <w:r>
+              <w:rPr/>
+              <w:t xml:space="preserve">NT$50萬</w:t>
+            </w:r>
+          </w:p>
+        </w:tc>
+        <w:tc>
+          <w:tcPr>
+            <w:tcBorders>
+              <w:top w:val="single" w:sz="1" w:space="0" w:color="000000"/>
+              <w:bottom w:val="single" w:sz="1" w:space="0" w:color="000000"/>
+              <w:left w:val="single" w:sz="1" w:space="0" w:color="000000"/>
+              <w:right w:val="single" w:sz="1" w:space="0" w:color="000000"/>
+            </w:tcBorders>
+          </w:tcPr>
+          <w:p>
+            <w:pPr>
+              <w:spacing w:lineRule="auto"/>
+            </w:pPr>
+            <w:r>
+              <w:rPr/>
+              <w:t xml:space="preserve">18萬</w:t>
+            </w:r>
+          </w:p>
+        </w:tc>
+      </w:tr>
+      <w:tr>
+        <w:trPr>
+          <w:cantSplit/>
+        </w:trPr>
+        <w:tc>
+          <w:tcPr>
+            <w:tcBorders>
+              <w:top w:val="single" w:sz="1" w:space="0" w:color="000000"/>
+              <w:bottom w:val="single" w:sz="1" w:space="0" w:color="000000"/>
+              <w:left w:val="single" w:sz="1" w:space="0" w:color="000000"/>
+              <w:right w:val="single" w:sz="1" w:space="0" w:color="000000"/>
+            </w:tcBorders>
+          </w:tcPr>
+          <w:p>
+            <w:pPr>
+              <w:spacing w:lineRule="auto"/>
+            </w:pPr>
+            <w:r>
+              <w:rPr>
+                <w:highlight w:val="lightGray"/>
+              </w:rPr>
+              <w:t xml:space="preserve">lunch</w:t>
+            </w:r>
+          </w:p>
+        </w:tc>
+        <w:tc>
+          <w:tcPr>
+            <w:tcBorders>
+              <w:top w:val="single" w:sz="1" w:space="0" w:color="000000"/>
+              <w:bottom w:val="single" w:sz="1" w:space="0" w:color="000000"/>
+              <w:left w:val="single" w:sz="1" w:space="0" w:color="000000"/>
+              <w:right w:val="single" w:sz="1" w:space="0" w:color="000000"/>
+            </w:tcBorders>
+          </w:tcPr>
+          <w:p>
+            <w:pPr>
+              <w:spacing w:lineRule="auto"/>
+            </w:pPr>
+            <w:r>
+              <w:rPr/>
+              <w:t xml:space="preserve">小朋友的營養午餐美學再造</w:t>
+            </w:r>
+          </w:p>
+        </w:tc>
+        <w:tc>
+          <w:tcPr>
+            <w:tcBorders>
+              <w:top w:val="single" w:sz="1" w:space="0" w:color="000000"/>
+              <w:bottom w:val="single" w:sz="1" w:space="0" w:color="000000"/>
+              <w:left w:val="single" w:sz="1" w:space="0" w:color="000000"/>
+              <w:right w:val="single" w:sz="1" w:space="0" w:color="000000"/>
+            </w:tcBorders>
+          </w:tcPr>
+          <w:p>
+            <w:pPr>
+              <w:spacing w:lineRule="auto"/>
+            </w:pPr>
+            <w:r>
+              <w:rPr/>
+              <w:t xml:space="preserve">標準</w:t>
+            </w:r>
+          </w:p>
+        </w:tc>
+        <w:tc>
+          <w:tcPr>
+            <w:tcBorders>
+              <w:top w:val="single" w:sz="1" w:space="0" w:color="000000"/>
+              <w:bottom w:val="single" w:sz="1" w:space="0" w:color="000000"/>
+              <w:left w:val="single" w:sz="1" w:space="0" w:color="000000"/>
+              <w:right w:val="single" w:sz="1" w:space="0" w:color="000000"/>
+            </w:tcBorders>
+          </w:tcPr>
+          <w:p>
+            <w:pPr>
+              <w:spacing w:lineRule="auto"/>
+            </w:pPr>
+            <w:r>
+              <w:rPr/>
+              <w:t xml:space="preserve">5 年</w:t>
+            </w:r>
+          </w:p>
+        </w:tc>
+        <w:tc>
+          <w:tcPr>
+            <w:tcBorders>
+              <w:top w:val="single" w:sz="1" w:space="0" w:color="000000"/>
+              <w:bottom w:val="single" w:sz="1" w:space="0" w:color="000000"/>
+              <w:left w:val="single" w:sz="1" w:space="0" w:color="000000"/>
+              <w:right w:val="single" w:sz="1" w:space="0" w:color="000000"/>
+            </w:tcBorders>
+          </w:tcPr>
+          <w:p>
+            <w:pPr>
+              <w:spacing w:lineRule="auto"/>
+            </w:pPr>
+            <w:r>
+              <w:rPr/>
+              <w:t xml:space="preserve">NT$2000萬</w:t>
+            </w:r>
+          </w:p>
+        </w:tc>
+        <w:tc>
+          <w:tcPr>
+            <w:tcBorders>
+              <w:top w:val="single" w:sz="1" w:space="0" w:color="000000"/>
+              <w:bottom w:val="single" w:sz="1" w:space="0" w:color="000000"/>
+              <w:left w:val="single" w:sz="1" w:space="0" w:color="000000"/>
+              <w:right w:val="single" w:sz="1" w:space="0" w:color="000000"/>
+            </w:tcBorders>
+          </w:tcPr>
+          <w:p>
+            <w:pPr>
+              <w:spacing w:lineRule="auto"/>
+            </w:pPr>
+            <w:r>
+              <w:rPr/>
+              <w:t xml:space="preserve">420萬</w:t>
+            </w:r>
+          </w:p>
+        </w:tc>
+      </w:tr>
+      <w:tr>
+        <w:trPr>
+          <w:cantSplit/>
+        </w:trPr>
+        <w:tc>
+          <w:tcPr>
+            <w:tcBorders>
+              <w:top w:val="single" w:sz="1" w:space="0" w:color="000000"/>
+              <w:bottom w:val="single" w:sz="1" w:space="0" w:color="000000"/>
+              <w:left w:val="single" w:sz="1" w:space="0" w:color="000000"/>
+              <w:right w:val="single" w:sz="1" w:space="0" w:color="000000"/>
+            </w:tcBorders>
+          </w:tcPr>
+          <w:p>
+            <w:pPr>
+              <w:spacing w:lineRule="auto"/>
+            </w:pPr>
+            <w:r>
+              <w:rPr>
+                <w:highlight w:val="lightGray"/>
+              </w:rPr>
+              <w:t xml:space="preserve">hall</w:t>
+            </w:r>
+          </w:p>
+        </w:tc>
+        <w:tc>
+          <w:tcPr>
+            <w:tcBorders>
+              <w:top w:val="single" w:sz="1" w:space="0" w:color="000000"/>
+              <w:bottom w:val="single" w:sz="1" w:space="0" w:color="000000"/>
+              <w:left w:val="single" w:sz="1" w:space="0" w:color="000000"/>
+              <w:right w:val="single" w:sz="1" w:space="0" w:color="000000"/>
+            </w:tcBorders>
+          </w:tcPr>
+          <w:p>
+            <w:pPr>
+              <w:spacing w:lineRule="auto"/>
+            </w:pPr>
+            <w:r>
+              <w:rPr/>
+              <w:t xml:space="preserve">大地音樂廳計畫</w:t>
+            </w:r>
+          </w:p>
+        </w:tc>
+        <w:tc>
+          <w:tcPr>
+            <w:tcBorders>
+              <w:top w:val="single" w:sz="1" w:space="0" w:color="000000"/>
+              <w:bottom w:val="single" w:sz="1" w:space="0" w:color="000000"/>
+              <w:left w:val="single" w:sz="1" w:space="0" w:color="000000"/>
+              <w:right w:val="single" w:sz="1" w:space="0" w:color="000000"/>
+            </w:tcBorders>
+          </w:tcPr>
+          <w:p>
+            <w:pPr>
+              <w:spacing w:lineRule="auto"/>
+            </w:pPr>
+            <w:r>
+              <w:rPr/>
+              <w:t xml:space="preserve">進階</w:t>
+            </w:r>
+          </w:p>
+        </w:tc>
+        <w:tc>
+          <w:tcPr>
+            <w:tcBorders>
+              <w:top w:val="single" w:sz="1" w:space="0" w:color="000000"/>
+              <w:bottom w:val="single" w:sz="1" w:space="0" w:color="000000"/>
+              <w:left w:val="single" w:sz="1" w:space="0" w:color="000000"/>
+              <w:right w:val="single" w:sz="1" w:space="0" w:color="000000"/>
+            </w:tcBorders>
+          </w:tcPr>
+          <w:p>
+            <w:pPr>
+              <w:spacing w:lineRule="auto"/>
+            </w:pPr>
+            <w:r>
+              <w:rPr/>
+              <w:t xml:space="preserve">2 年</w:t>
+            </w:r>
+          </w:p>
+        </w:tc>
+        <w:tc>
+          <w:tcPr>
+            <w:tcBorders>
+              <w:top w:val="single" w:sz="1" w:space="0" w:color="000000"/>
+              <w:bottom w:val="single" w:sz="1" w:space="0" w:color="000000"/>
+              <w:left w:val="single" w:sz="1" w:space="0" w:color="000000"/>
+              <w:right w:val="single" w:sz="1" w:space="0" w:color="000000"/>
+            </w:tcBorders>
+          </w:tcPr>
+          <w:p>
+            <w:pPr>
+              <w:spacing w:lineRule="auto"/>
+            </w:pPr>
+            <w:r>
+              <w:rPr/>
+              <w:t xml:space="preserve">NT$500萬</w:t>
+            </w:r>
+          </w:p>
+        </w:tc>
+        <w:tc>
+          <w:tcPr>
+            <w:tcBorders>
+              <w:top w:val="single" w:sz="1" w:space="0" w:color="000000"/>
+              <w:bottom w:val="single" w:sz="1" w:space="0" w:color="000000"/>
+              <w:left w:val="single" w:sz="1" w:space="0" w:color="000000"/>
+              <w:right w:val="single" w:sz="1" w:space="0" w:color="000000"/>
+            </w:tcBorders>
+          </w:tcPr>
+          <w:p>
+            <w:pPr>
+              <w:spacing w:lineRule="auto"/>
+            </w:pPr>
+            <w:r>
+              <w:rPr/>
+              <w:t xml:space="preserve">475萬（95%）</w:t>
+            </w:r>
+          </w:p>
+        </w:tc>
       </w:tr>
     </w:tbl>
     <w:p>
@@ -1950,15 +2401,72 @@
       </w:pPr>
       <w:r>
         <w:rPr/>
+        <w:t xml:space="preserve">lunch</w:t>
+      </w:r>
+      <w:r>
+        <w:rPr/>
+        <w:t xml:space="preserve">、</w:t>
+      </w:r>
+      <w:r>
+        <w:rPr/>
+        <w:t xml:space="preserve">hall</w:t>
+      </w:r>
+      <w:r>
+        <w:rPr/>
+        <w:t xml:space="preserve"> 的規格文件未寫標準／進階／最高。Demo 將營養午餐設為</w:t>
+      </w:r>
+      <w:r>
+        <w:rPr>
+          <w:b/>
+        </w:rPr>
+        <w:t xml:space="preserve">標準</w:t>
+      </w:r>
+      <w:r>
+        <w:rPr/>
+        <w:t xml:space="preserve">（知遇卡起可支持為孩子的計畫），大地音樂廳設為</w:t>
+      </w:r>
+      <w:r>
+        <w:rPr>
+          <w:b/>
+        </w:rPr>
+        <w:t xml:space="preserve">進階</w:t>
+      </w:r>
+      <w:r>
+        <w:rPr/>
+        <w:t xml:space="preserve">（對齊音樂會）。若決策改成知己專屬，只改 </w:t>
+      </w:r>
+      <w:r>
+        <w:rPr/>
+        <w:t xml:space="preserve">qualityTier</w:t>
+      </w:r>
+      <w:r>
+        <w:rPr/>
+        <w:t xml:space="preserve">。</w:t>
+      </w:r>
+    </w:p>
+    <w:p>
+      <w:pPr>
+        <w:spacing w:lineRule="auto"/>
+      </w:pPr>
+      <w:r>
+        <w:rPr/>
         <w:t xml:space="preserve">選計畫時以 </w:t>
       </w:r>
       <w:r>
         <w:rPr/>
-        <w:t xml:space="preserve">projectAllowed(tier.projectTierAllowed, project.qualityTier)</w:t>
-      </w:r>
-      <w:r>
-        <w:rPr/>
-        <w:t xml:space="preserve"> 過濾；達上限則不能再加。知己卡 </w:t>
+        <w:t xml:space="preserve">projectAllowed(...)</w:t>
+      </w:r>
+      <w:r>
+        <w:rPr/>
+        <w:t xml:space="preserve"> 過濾；達卡別上限或 </w:t>
+      </w:r>
+      <w:r>
+        <w:rPr/>
+        <w:t xml:space="preserve">isFunded(project)</w:t>
+      </w:r>
+      <w:r>
+        <w:rPr/>
+        <w:t xml:space="preserve">（已募 ≥ 目標）則不能再加入。知己卡 </w:t>
       </w:r>
       <w:r>
         <w:rPr/>
@@ -1971,12 +2479,141 @@
     </w:p>
     <w:p>
       <w:pPr>
+        <w:spacing w:lineRule="auto"/>
+      </w:pPr>
+      <w:r>
+        <w:rPr/>
+        <w:t xml:space="preserve">圖示：</w:t>
+      </w:r>
+      <w:r>
+        <w:rPr/>
+        <w:t xml:space="preserve">projectIcon(category, id)</w:t>
+      </w:r>
+      <w:r>
+        <w:rPr/>
+        <w:t xml:space="preserve">；</w:t>
+      </w:r>
+      <w:r>
+        <w:rPr/>
+        <w:t xml:space="preserve">lunch</w:t>
+      </w:r>
+      <w:r>
+        <w:rPr/>
+        <w:t xml:space="preserve">／</w:t>
+      </w:r>
+      <w:r>
+        <w:rPr/>
+        <w:t xml:space="preserve">hall</w:t>
+      </w:r>
+      <w:r>
+        <w:rPr/>
+        <w:t xml:space="preserve"> 有專用圖示，其餘依飲食／音樂／工藝。</w:t>
+      </w:r>
+    </w:p>
+    <w:p>
+      <w:pPr>
         <w:pStyle w:val="Heading3"/>
         <w:spacing w:lineRule="auto"/>
       </w:pPr>
       <w:r>
         <w:rPr/>
-        <w:t xml:space="preserve">4.4 邀請制</w:t>
+        <w:t xml:space="preserve">4.4 募集與額滿</w:t>
+      </w:r>
+    </w:p>
+    <w:p>
+      <w:pPr>
+        <w:spacing w:lineRule="auto"/>
+      </w:pPr>
+      <w:r>
+        <w:rPr/>
+        <w:t xml:space="preserve">每項計畫有 </w:t>
+      </w:r>
+      <w:r>
+        <w:rPr/>
+        <w:t xml:space="preserve">targetAmount</w:t>
+      </w:r>
+      <w:r>
+        <w:rPr/>
+        <w:t xml:space="preserve">、</w:t>
+      </w:r>
+      <w:r>
+        <w:rPr/>
+        <w:t xml:space="preserve">raisedAmount</w:t>
+      </w:r>
+      <w:r>
+        <w:rPr/>
+        <w:t xml:space="preserve">（新台幣整數）。畫面用 </w:t>
+      </w:r>
+      <w:r>
+        <w:rPr/>
+        <w:t xml:space="preserve">formatWan()</w:t>
+      </w:r>
+      <w:r>
+        <w:rPr/>
+        <w:t xml:space="preserve"> 顯示「NT$xx萬」。</w:t>
+      </w:r>
+    </w:p>
+    <w:p>
+      <w:pPr>
+        <w:numPr>
+          <w:ilvl w:val="0"/>
+          <w:numId w:val="3"/>
+        </w:numPr>
+        <w:spacing w:lineRule="auto"/>
+      </w:pPr>
+      <w:r>
+        <w:rPr/>
+        <w:t xml:space="preserve">未額滿：顯示目標、已募、百分比進度條</w:t>
+      </w:r>
+    </w:p>
+    <w:p>
+      <w:pPr>
+        <w:numPr>
+          <w:ilvl w:val="0"/>
+          <w:numId w:val="3"/>
+        </w:numPr>
+        <w:spacing w:lineRule="auto"/>
+      </w:pPr>
+      <w:r>
+        <w:rPr/>
+        <w:t xml:space="preserve">額滿：文案「額滿，停止募集」，卡片不可點選（</w:t>
+      </w:r>
+      <w:r>
+        <w:rPr/>
+        <w:t xml:space="preserve">AppContext.toggleProject</w:t>
+      </w:r>
+      <w:r>
+        <w:rPr/>
+        <w:t xml:space="preserve"> 也會拒絕）</w:t>
+      </w:r>
+    </w:p>
+    <w:p>
+      <w:pPr>
+        <w:spacing w:lineRule="auto"/>
+      </w:pPr>
+      <w:r>
+        <w:rPr/>
+        <w:t xml:space="preserve">Demo </w:t>
+      </w:r>
+      <w:r>
+        <w:rPr>
+          <w:b/>
+        </w:rPr>
+        <w:t xml:space="preserve">不會</w:t>
+      </w:r>
+      <w:r>
+        <w:rPr/>
+        <w:t xml:space="preserve">在鎖定後把已募金額加上去。正式產品必須把「年費」與「計畫募集進度」分開記帳，並由伺服器判定額滿。</w:t>
+      </w:r>
+    </w:p>
+    <w:p>
+      <w:pPr>
+        <w:pStyle w:val="Heading3"/>
+        <w:spacing w:lineRule="auto"/>
+      </w:pPr>
+      <w:r>
+        <w:rPr/>
+        <w:t xml:space="preserve">4.5 邀請制</w:t>
       </w:r>
     </w:p>
     <w:p>
@@ -2876,7 +3513,7 @@
             </w:pPr>
             <w:r>
               <w:rPr/>
-              <w:t xml:space="preserve">計畫故事、階段文案、年限</w:t>
+              <w:t xml:space="preserve">計畫故事、階段文案、年限、募集目標與已募</w:t>
             </w:r>
           </w:p>
         </w:tc>
@@ -2898,6 +3535,55 @@
                 <w:highlight w:val="lightGray"/>
               </w:rPr>
               <w:t xml:space="preserve">PROJECTS</w:t>
+            </w:r>
+          </w:p>
+          <w:p>
+            <w:pPr>
+              <w:spacing w:lineRule="auto"/>
+            </w:pPr>
+            <w:r>
+              <w:rPr/>
+              <w:t xml:space="preserve">（</w:t>
+            </w:r>
+          </w:p>
+          <w:p>
+            <w:pPr>
+              <w:spacing w:lineRule="auto"/>
+            </w:pPr>
+            <w:r>
+              <w:rPr>
+                <w:highlight w:val="lightGray"/>
+              </w:rPr>
+              <w:t xml:space="preserve">targetAmount</w:t>
+            </w:r>
+          </w:p>
+          <w:p>
+            <w:pPr>
+              <w:spacing w:lineRule="auto"/>
+            </w:pPr>
+            <w:r>
+              <w:rPr/>
+              <w:t xml:space="preserve">、</w:t>
+            </w:r>
+          </w:p>
+          <w:p>
+            <w:pPr>
+              <w:spacing w:lineRule="auto"/>
+            </w:pPr>
+            <w:r>
+              <w:rPr>
+                <w:highlight w:val="lightGray"/>
+              </w:rPr>
+              <w:t xml:space="preserve">raisedAmount</w:t>
+            </w:r>
+          </w:p>
+          <w:p>
+            <w:pPr>
+              <w:spacing w:lineRule="auto"/>
+            </w:pPr>
+            <w:r>
+              <w:rPr/>
+              <w:t xml:space="preserve">）</w:t>
             </w:r>
           </w:p>
         </w:tc>
@@ -2921,7 +3607,7 @@
             </w:pPr>
             <w:r>
               <w:rPr/>
-              <w:t xml:space="preserve">對照表／儀表板呈現</w:t>
+              <w:t xml:space="preserve">額滿判定</w:t>
             </w:r>
           </w:p>
         </w:tc>
@@ -2942,7 +3628,7 @@
               <w:rPr>
                 <w:highlight w:val="lightGray"/>
               </w:rPr>
-              <w:t xml:space="preserve">AddOnTable.tsx</w:t>
+              <w:t xml:space="preserve">isFunded()</w:t>
             </w:r>
           </w:p>
           <w:p>
@@ -2962,7 +3648,27 @@
               <w:rPr>
                 <w:highlight w:val="lightGray"/>
               </w:rPr>
-              <w:t xml:space="preserve">Dashboard.tsx</w:t>
+              <w:t xml:space="preserve">fundPercent()</w:t>
+            </w:r>
+          </w:p>
+          <w:p>
+            <w:pPr>
+              <w:spacing w:lineRule="auto"/>
+            </w:pPr>
+            <w:r>
+              <w:rPr/>
+              <w:t xml:space="preserve">；鎖定攔截在 </w:t>
+            </w:r>
+          </w:p>
+          <w:p>
+            <w:pPr>
+              <w:spacing w:lineRule="auto"/>
+            </w:pPr>
+            <w:r>
+              <w:rPr>
+                <w:highlight w:val="lightGray"/>
+              </w:rPr>
+              <w:t xml:space="preserve">AppContext.tsx</w:t>
             </w:r>
           </w:p>
         </w:tc>
@@ -2986,7 +3692,7 @@
             </w:pPr>
             <w:r>
               <w:rPr/>
-              <w:t xml:space="preserve">禮遇圖示</w:t>
+              <w:t xml:space="preserve">計畫圖示</w:t>
             </w:r>
           </w:p>
         </w:tc>
@@ -3027,16 +3733,7 @@
               <w:rPr>
                 <w:highlight w:val="lightGray"/>
               </w:rPr>
-              <w:t xml:space="preserve">benefitIcon(id)</w:t>
-            </w:r>
-          </w:p>
-          <w:p>
-            <w:pPr>
-              <w:spacing w:lineRule="auto"/>
-            </w:pPr>
-            <w:r>
-              <w:rPr/>
-              <w:t xml:space="preserve">，id 必須對上禮遇 id</w:t>
+              <w:t xml:space="preserve">projectIcon(category, id)</w:t>
             </w:r>
           </w:p>
         </w:tc>
@@ -3060,7 +3757,7 @@
             </w:pPr>
             <w:r>
               <w:rPr/>
-              <w:t xml:space="preserve">色票與字級</w:t>
+              <w:t xml:space="preserve">對照表／儀表板呈現</w:t>
             </w:r>
           </w:p>
         </w:tc>
@@ -3081,7 +3778,27 @@
               <w:rPr>
                 <w:highlight w:val="lightGray"/>
               </w:rPr>
-              <w:t xml:space="preserve">src/index.css</w:t>
+              <w:t xml:space="preserve">AddOnTable.tsx</w:t>
+            </w:r>
+          </w:p>
+          <w:p>
+            <w:pPr>
+              <w:spacing w:lineRule="auto"/>
+            </w:pPr>
+            <w:r>
+              <w:rPr/>
+              <w:t xml:space="preserve">、</w:t>
+            </w:r>
+          </w:p>
+          <w:p>
+            <w:pPr>
+              <w:spacing w:lineRule="auto"/>
+            </w:pPr>
+            <w:r>
+              <w:rPr>
+                <w:highlight w:val="lightGray"/>
+              </w:rPr>
+              <w:t xml:space="preserve">Dashboard.tsx</w:t>
             </w:r>
           </w:p>
         </w:tc>
@@ -3105,6 +3822,125 @@
             </w:pPr>
             <w:r>
               <w:rPr/>
+              <w:t xml:space="preserve">禮遇圖示</w:t>
+            </w:r>
+          </w:p>
+        </w:tc>
+        <w:tc>
+          <w:tcPr>
+            <w:tcBorders>
+              <w:top w:val="single" w:sz="1" w:space="0" w:color="000000"/>
+              <w:bottom w:val="single" w:sz="1" w:space="0" w:color="000000"/>
+              <w:left w:val="single" w:sz="1" w:space="0" w:color="000000"/>
+              <w:right w:val="single" w:sz="1" w:space="0" w:color="000000"/>
+            </w:tcBorders>
+          </w:tcPr>
+          <w:p>
+            <w:pPr>
+              <w:spacing w:lineRule="auto"/>
+            </w:pPr>
+            <w:r>
+              <w:rPr>
+                <w:highlight w:val="lightGray"/>
+              </w:rPr>
+              <w:t xml:space="preserve">Icons.tsx</w:t>
+            </w:r>
+          </w:p>
+          <w:p>
+            <w:pPr>
+              <w:spacing w:lineRule="auto"/>
+            </w:pPr>
+            <w:r>
+              <w:rPr/>
+              <w:t xml:space="preserve"> 的 </w:t>
+            </w:r>
+          </w:p>
+          <w:p>
+            <w:pPr>
+              <w:spacing w:lineRule="auto"/>
+            </w:pPr>
+            <w:r>
+              <w:rPr>
+                <w:highlight w:val="lightGray"/>
+              </w:rPr>
+              <w:t xml:space="preserve">benefitIcon(id)</w:t>
+            </w:r>
+          </w:p>
+          <w:p>
+            <w:pPr>
+              <w:spacing w:lineRule="auto"/>
+            </w:pPr>
+            <w:r>
+              <w:rPr/>
+              <w:t xml:space="preserve">，id 必須對上禮遇 id</w:t>
+            </w:r>
+          </w:p>
+        </w:tc>
+      </w:tr>
+      <w:tr>
+        <w:trPr>
+          <w:cantSplit/>
+        </w:trPr>
+        <w:tc>
+          <w:tcPr>
+            <w:tcBorders>
+              <w:top w:val="single" w:sz="1" w:space="0" w:color="000000"/>
+              <w:bottom w:val="single" w:sz="1" w:space="0" w:color="000000"/>
+              <w:left w:val="single" w:sz="1" w:space="0" w:color="000000"/>
+              <w:right w:val="single" w:sz="1" w:space="0" w:color="000000"/>
+            </w:tcBorders>
+          </w:tcPr>
+          <w:p>
+            <w:pPr>
+              <w:spacing w:lineRule="auto"/>
+            </w:pPr>
+            <w:r>
+              <w:rPr/>
+              <w:t xml:space="preserve">色票與字級</w:t>
+            </w:r>
+          </w:p>
+        </w:tc>
+        <w:tc>
+          <w:tcPr>
+            <w:tcBorders>
+              <w:top w:val="single" w:sz="1" w:space="0" w:color="000000"/>
+              <w:bottom w:val="single" w:sz="1" w:space="0" w:color="000000"/>
+              <w:left w:val="single" w:sz="1" w:space="0" w:color="000000"/>
+              <w:right w:val="single" w:sz="1" w:space="0" w:color="000000"/>
+            </w:tcBorders>
+          </w:tcPr>
+          <w:p>
+            <w:pPr>
+              <w:spacing w:lineRule="auto"/>
+            </w:pPr>
+            <w:r>
+              <w:rPr>
+                <w:highlight w:val="lightGray"/>
+              </w:rPr>
+              <w:t xml:space="preserve">src/index.css</w:t>
+            </w:r>
+          </w:p>
+        </w:tc>
+      </w:tr>
+      <w:tr>
+        <w:trPr>
+          <w:cantSplit/>
+        </w:trPr>
+        <w:tc>
+          <w:tcPr>
+            <w:tcBorders>
+              <w:top w:val="single" w:sz="1" w:space="0" w:color="000000"/>
+              <w:bottom w:val="single" w:sz="1" w:space="0" w:color="000000"/>
+              <w:left w:val="single" w:sz="1" w:space="0" w:color="000000"/>
+              <w:right w:val="single" w:sz="1" w:space="0" w:color="000000"/>
+            </w:tcBorders>
+          </w:tcPr>
+          <w:p>
+            <w:pPr>
+              <w:spacing w:lineRule="auto"/>
+            </w:pPr>
+            <w:r>
+              <w:rPr/>
               <w:t xml:space="preserve">流程規則（邀請、上限、鎖定）</w:t>
             </w:r>
           </w:p>
@@ -3197,7 +4033,7 @@
       <w:pPr>
         <w:numPr>
           <w:ilvl w:val="0"/>
-          <w:numId w:val="3"/>
+          <w:numId w:val="4"/>
         </w:numPr>
         <w:spacing w:lineRule="auto"/>
       </w:pPr>
@@ -3224,79 +4060,6 @@
       <w:r>
         <w:rPr/>
         <w:t xml:space="preserve">#D9A441</w:t>
-      </w:r>
-    </w:p>
-    <w:p>
-      <w:pPr>
-        <w:numPr>
-          <w:ilvl w:val="0"/>
-          <w:numId w:val="3"/>
-        </w:numPr>
-        <w:spacing w:lineRule="auto"/>
-      </w:pPr>
-      <w:r>
-        <w:rPr/>
-        <w:t xml:space="preserve">白底圓角卡片（</w:t>
-      </w:r>
-      <w:r>
-        <w:rPr/>
-        <w:t xml:space="preserve">.panel</w:t>
-      </w:r>
-      <w:r>
-        <w:rPr/>
-        <w:t xml:space="preserve">），動效偏慢（</w:t>
-      </w:r>
-      <w:r>
-        <w:rPr/>
-        <w:t xml:space="preserve">.page-in</w:t>
-      </w:r>
-      <w:r>
-        <w:rPr/>
-        <w:t xml:space="preserve">）</w:t>
-      </w:r>
-    </w:p>
-    <w:p>
-      <w:pPr>
-        <w:numPr>
-          <w:ilvl w:val="0"/>
-          <w:numId w:val="3"/>
-        </w:numPr>
-        <w:spacing w:lineRule="auto"/>
-      </w:pPr>
-      <w:r>
-        <w:rPr/>
-        <w:t xml:space="preserve">提貨券做成票根／印章感（</w:t>
-      </w:r>
-      <w:r>
-        <w:rPr/>
-        <w:t xml:space="preserve">.ticket</w:t>
-      </w:r>
-      <w:r>
-        <w:rPr/>
-        <w:t xml:space="preserve">），不要做成一般 app 列表列</w:t>
-      </w:r>
-    </w:p>
-    <w:p>
-      <w:pPr>
-        <w:numPr>
-          <w:ilvl w:val="0"/>
-          <w:numId w:val="3"/>
-        </w:numPr>
-        <w:spacing w:lineRule="auto"/>
-      </w:pPr>
-      <w:r>
-        <w:rPr/>
-        <w:t xml:space="preserve">附加禮遇對照：色點勾選＝享有，金圈＝未含；欄位色對應三張卡，不要用「有／無」文字矩陣</w:t>
-      </w:r>
-    </w:p>
-    <w:p>
-      <w:pPr>
-        <w:pStyle w:val="Heading2"/>
-        <w:spacing w:lineRule="auto"/>
-      </w:pPr>
-      <w:r>
-        <w:rPr/>
-        <w:t xml:space="preserve">9. 展示腳本（給操作者）</w:t>
       </w:r>
     </w:p>
     <w:p>
@@ -3309,7 +4072,23 @@
       </w:pPr>
       <w:r>
         <w:rPr/>
-        <w:t xml:space="preserve">Landing：預見／回應現在 vs 回應未來。</w:t>
+        <w:t xml:space="preserve">白底圓角卡片（</w:t>
+      </w:r>
+      <w:r>
+        <w:rPr/>
+        <w:t xml:space="preserve">.panel</w:t>
+      </w:r>
+      <w:r>
+        <w:rPr/>
+        <w:t xml:space="preserve">），動效偏慢（</w:t>
+      </w:r>
+      <w:r>
+        <w:rPr/>
+        <w:t xml:space="preserve">.page-in</w:t>
+      </w:r>
+      <w:r>
+        <w:rPr/>
+        <w:t xml:space="preserve">）</w:t>
       </w:r>
     </w:p>
     <w:p>
@@ -3322,7 +4101,15 @@
       </w:pPr>
       <w:r>
         <w:rPr/>
-        <w:t xml:space="preserve">選卡：說明三張卡差異（項數、規格、知己邀請制），捲到附加禮遇對照。</w:t>
+        <w:t xml:space="preserve">提貨券做成票根／印章感（</w:t>
+      </w:r>
+      <w:r>
+        <w:rPr/>
+        <w:t xml:space="preserve">.ticket</w:t>
+      </w:r>
+      <w:r>
+        <w:rPr/>
+        <w:t xml:space="preserve">），不要做成一般 app 列表列</w:t>
       </w:r>
     </w:p>
     <w:p>
@@ -3335,81 +4122,7 @@
       </w:pPr>
       <w:r>
         <w:rPr/>
-        <w:t xml:space="preserve">建議走知音卡：可選標準＋進階，對照表與儀表板都會看到第二層禮遇。</w:t>
-      </w:r>
-    </w:p>
-    <w:p>
-      <w:pPr>
-        <w:numPr>
-          <w:ilvl w:val="0"/>
-          <w:numId w:val="4"/>
-        </w:numPr>
-        <w:spacing w:lineRule="auto"/>
-      </w:pPr>
-      <w:r>
-        <w:rPr/>
-        <w:t xml:space="preserve">選「封藏豆腐乳」（必要時再加音樂會）。</w:t>
-      </w:r>
-    </w:p>
-    <w:p>
-      <w:pPr>
-        <w:numPr>
-          <w:ilvl w:val="0"/>
-          <w:numId w:val="4"/>
-        </w:numPr>
-        <w:spacing w:lineRule="auto"/>
-      </w:pPr>
-      <w:r>
-        <w:rPr/>
-        <w:t xml:space="preserve">鎖定彈窗：勾選、強調恕不退費。</w:t>
-      </w:r>
-    </w:p>
-    <w:p>
-      <w:pPr>
-        <w:numPr>
-          <w:ilvl w:val="0"/>
-          <w:numId w:val="4"/>
-        </w:numPr>
-        <w:spacing w:lineRule="auto"/>
-      </w:pPr>
-      <w:r>
-        <w:rPr/>
-        <w:t xml:space="preserve">提貨券畫面：指出編號與兌現日，「這不是點數」。</w:t>
-      </w:r>
-    </w:p>
-    <w:p>
-      <w:pPr>
-        <w:numPr>
-          <w:ilvl w:val="0"/>
-          <w:numId w:val="4"/>
-        </w:numPr>
-        <w:spacing w:lineRule="auto"/>
-      </w:pPr>
-      <w:r>
-        <w:rPr/>
-        <w:t xml:space="preserve">儀表板按「模擬時間前進一年」，看核對頁前後文案。</w:t>
-      </w:r>
-    </w:p>
-    <w:p>
-      <w:pPr>
-        <w:numPr>
-          <w:ilvl w:val="0"/>
-          <w:numId w:val="4"/>
-        </w:numPr>
-        <w:spacing w:lineRule="auto"/>
-      </w:pPr>
-      <w:r>
-        <w:rPr/>
-        <w:t xml:space="preserve">需要重來：按「重新體驗」。</w:t>
-      </w:r>
-    </w:p>
-    <w:p>
-      <w:pPr>
-        <w:spacing w:lineRule="auto"/>
-      </w:pPr>
-      <w:r>
-        <w:rPr/>
-        <w:t xml:space="preserve">知己卡展示：選知己 → 邀請畫面任意輸入 → 可選梅酒（最高規格）。</w:t>
+        <w:t xml:space="preserve">附加禮遇對照：色點勾選＝享有，金圈＝未含；欄位色對應三張卡，不要用「有／無」文字矩陣</w:t>
       </w:r>
     </w:p>
     <w:p>
@@ -3419,7 +4132,7 @@
       </w:pPr>
       <w:r>
         <w:rPr/>
-        <w:t xml:space="preserve">10. 開發注意</w:t>
+        <w:t xml:space="preserve">9. 展示腳本（給操作者）</w:t>
       </w:r>
     </w:p>
     <w:p>
@@ -3431,6 +4144,138 @@
         <w:spacing w:lineRule="auto"/>
       </w:pPr>
       <w:r>
+        <w:rPr/>
+        <w:t xml:space="preserve">Landing：預見／回應現在 vs 回應未來。</w:t>
+      </w:r>
+    </w:p>
+    <w:p>
+      <w:pPr>
+        <w:numPr>
+          <w:ilvl w:val="0"/>
+          <w:numId w:val="5"/>
+        </w:numPr>
+        <w:spacing w:lineRule="auto"/>
+      </w:pPr>
+      <w:r>
+        <w:rPr/>
+        <w:t xml:space="preserve">選卡：說明三張卡差異（項數、規格、知己邀請制），捲到附加禮遇對照。</w:t>
+      </w:r>
+    </w:p>
+    <w:p>
+      <w:pPr>
+        <w:numPr>
+          <w:ilvl w:val="0"/>
+          <w:numId w:val="5"/>
+        </w:numPr>
+        <w:spacing w:lineRule="auto"/>
+      </w:pPr>
+      <w:r>
+        <w:rPr/>
+        <w:t xml:space="preserve">建議走知音卡：可選標準＋進階；對照表與儀表板會看到第二層禮遇。</w:t>
+      </w:r>
+    </w:p>
+    <w:p>
+      <w:pPr>
+        <w:numPr>
+          <w:ilvl w:val="0"/>
+          <w:numId w:val="5"/>
+        </w:numPr>
+        <w:spacing w:lineRule="auto"/>
+      </w:pPr>
+      <w:r>
+        <w:rPr/>
+        <w:t xml:space="preserve">選計畫：指出「專屬音樂會」已額滿；知音可改選「封藏豆腐乳」與「大地音樂廳計畫」。</w:t>
+      </w:r>
+    </w:p>
+    <w:p>
+      <w:pPr>
+        <w:numPr>
+          <w:ilvl w:val="0"/>
+          <w:numId w:val="5"/>
+        </w:numPr>
+        <w:spacing w:lineRule="auto"/>
+      </w:pPr>
+      <w:r>
+        <w:rPr/>
+        <w:t xml:space="preserve">鎖定彈窗：勾選、強調恕不退費。</w:t>
+      </w:r>
+    </w:p>
+    <w:p>
+      <w:pPr>
+        <w:numPr>
+          <w:ilvl w:val="0"/>
+          <w:numId w:val="5"/>
+        </w:numPr>
+        <w:spacing w:lineRule="auto"/>
+      </w:pPr>
+      <w:r>
+        <w:rPr/>
+        <w:t xml:space="preserve">提貨券畫面：指出編號與兌現日，「這不是點數」。</w:t>
+      </w:r>
+    </w:p>
+    <w:p>
+      <w:pPr>
+        <w:numPr>
+          <w:ilvl w:val="0"/>
+          <w:numId w:val="5"/>
+        </w:numPr>
+        <w:spacing w:lineRule="auto"/>
+      </w:pPr>
+      <w:r>
+        <w:rPr/>
+        <w:t xml:space="preserve">儀表板按「模擬時間前進一年」，看核對頁前後文案。</w:t>
+      </w:r>
+    </w:p>
+    <w:p>
+      <w:pPr>
+        <w:numPr>
+          <w:ilvl w:val="0"/>
+          <w:numId w:val="5"/>
+        </w:numPr>
+        <w:spacing w:lineRule="auto"/>
+      </w:pPr>
+      <w:r>
+        <w:rPr/>
+        <w:t xml:space="preserve">需要重來：按「重新體驗」。</w:t>
+      </w:r>
+    </w:p>
+    <w:p>
+      <w:pPr>
+        <w:spacing w:lineRule="auto"/>
+      </w:pPr>
+      <w:r>
+        <w:rPr/>
+        <w:t xml:space="preserve">知遇卡：可在豆腐乳與營養午餐之間擇一（上限 1 項）。</w:t>
+      </w:r>
+    </w:p>
+    <w:p>
+      <w:pPr>
+        <w:spacing w:lineRule="auto"/>
+      </w:pPr>
+      <w:r>
+        <w:rPr/>
+        <w:t xml:space="preserve">知己卡：選知己 → 邀請畫面任意輸入 → 可選梅酒（最高規格）。</w:t>
+      </w:r>
+    </w:p>
+    <w:p>
+      <w:pPr>
+        <w:pStyle w:val="Heading2"/>
+        <w:spacing w:lineRule="auto"/>
+      </w:pPr>
+      <w:r>
+        <w:rPr/>
+        <w:t xml:space="preserve">10. 開發注意</w:t>
+      </w:r>
+    </w:p>
+    <w:p>
+      <w:pPr>
+        <w:numPr>
+          <w:ilvl w:val="0"/>
+          <w:numId w:val="6"/>
+        </w:numPr>
+        <w:spacing w:lineRule="auto"/>
+      </w:pPr>
+      <w:r>
         <w:rPr>
           <w:b/>
         </w:rPr>
@@ -3438,14 +4283,41 @@
       </w:r>
       <w:r>
         <w:rPr/>
-        <w:t xml:space="preserve">：空白即過的邀請碼、本機時間快轉、單一「示範會員」。</w:t>
+        <w:t xml:space="preserve">：空白即過的邀請碼、本機時間快轉、單一「示範會員」、鎖定後募集金額不增加。</w:t>
       </w:r>
     </w:p>
     <w:p>
       <w:pPr>
         <w:numPr>
           <w:ilvl w:val="0"/>
-          <w:numId w:val="5"/>
+          <w:numId w:val="6"/>
+        </w:numPr>
+        <w:spacing w:lineRule="auto"/>
+      </w:pPr>
+      <w:r>
+        <w:rPr>
+          <w:b/>
+        </w:rPr>
+        <w:t xml:space="preserve">年費 ≠ 計畫募集</w:t>
+      </w:r>
+      <w:r>
+        <w:rPr/>
+        <w:t xml:space="preserve">：卡片年費與計畫 </w:t>
+      </w:r>
+      <w:r>
+        <w:rPr/>
+        <w:t xml:space="preserve">targetAmount</w:t>
+      </w:r>
+      <w:r>
+        <w:rPr/>
+        <w:t xml:space="preserve"> 是兩套數字。Demo 只展示後者的進度條。</w:t>
+      </w:r>
+    </w:p>
+    <w:p>
+      <w:pPr>
+        <w:numPr>
+          <w:ilvl w:val="0"/>
+          <w:numId w:val="6"/>
         </w:numPr>
         <w:spacing w:lineRule="auto"/>
       </w:pPr>
@@ -3464,7 +4336,7 @@
       <w:pPr>
         <w:numPr>
           <w:ilvl w:val="0"/>
-          <w:numId w:val="5"/>
+          <w:numId w:val="6"/>
         </w:numPr>
         <w:spacing w:lineRule="auto"/>
       </w:pPr>
@@ -3491,7 +4363,7 @@
       <w:pPr>
         <w:numPr>
           <w:ilvl w:val="0"/>
-          <w:numId w:val="5"/>
+          <w:numId w:val="6"/>
         </w:numPr>
         <w:spacing w:lineRule="auto"/>
       </w:pPr>
@@ -3534,7 +4406,7 @@
       <w:pPr>
         <w:numPr>
           <w:ilvl w:val="0"/>
-          <w:numId w:val="5"/>
+          <w:numId w:val="6"/>
         </w:numPr>
         <w:spacing w:lineRule="auto"/>
       </w:pPr>
@@ -3581,7 +4453,7 @@
         <w:rPr>
           <w:b/>
         </w:rPr>
-        <w:t xml:space="preserve">目前程式以三卡 v2.1 為準。</w:t>
+        <w:t xml:space="preserve">目前程式以三卡 v2.1、五項計畫與募集額滿為準。</w:t>
       </w:r>
       <w:r>
         <w:rPr/>
@@ -3593,7 +4465,7 @@
       </w:r>
       <w:r>
         <w:rPr/>
-        <w:t xml:space="preserve">，不要把舊稿的年費與卡名改回去。</w:t>
+        <w:t xml:space="preserve">。</w:t>
       </w:r>
     </w:p>
   </w:body>
@@ -3987,6 +4859,128 @@
   <w:abstractNum w:abstractNumId="4">
     <w:lvl w:ilvl="0">
       <w:start w:val="1"/>
+      <w:numFmt w:val="bullet"/>
+      <w:lvlText w:val=""/>
+      <w:lvlJc w:val="left"/>
+      <w:pPr>
+        <w:tabs>
+          <w:tab w:val="num" w:pos="720"/>
+        </w:tabs>
+        <w:ind w:left="720" w:hanging="360"/>
+      </w:pPr>
+      <w:rPr>
+        <w:rFonts w:ascii="Symbol" w:hAnsi="Symbol" w:hint="default"/>
+      </w:rPr>
+    </w:lvl>
+    <w:lvl w:ilvl="1">
+      <w:start w:val="1"/>
+      <w:numFmt w:val="bullet"/>
+      <w:lvlText w:val=""/>
+      <w:lvlJc w:val="left"/>
+      <w:pPr>
+        <w:tabs>
+          <w:tab w:val="num" w:pos="1440"/>
+        </w:tabs>
+        <w:ind w:left="1440" w:hanging="360"/>
+      </w:pPr>
+      <w:rPr>
+        <w:rFonts w:ascii="Symbol" w:hAnsi="Symbol" w:hint="default"/>
+      </w:rPr>
+    </w:lvl>
+    <w:lvl w:ilvl="2">
+      <w:start w:val="1"/>
+      <w:numFmt w:val="bullet"/>
+      <w:lvlText w:val=""/>
+      <w:lvlJc w:val="left"/>
+      <w:pPr>
+        <w:tabs>
+          <w:tab w:val="num" w:pos="2160"/>
+        </w:tabs>
+        <w:ind w:left="2160" w:hanging="360"/>
+      </w:pPr>
+      <w:rPr>
+        <w:rFonts w:ascii="Symbol" w:hAnsi="Symbol" w:hint="default"/>
+      </w:rPr>
+    </w:lvl>
+    <w:lvl w:ilvl="3">
+      <w:start w:val="1"/>
+      <w:numFmt w:val="bullet"/>
+      <w:lvlText w:val=""/>
+      <w:lvlJc w:val="left"/>
+      <w:pPr>
+        <w:tabs>
+          <w:tab w:val="num" w:pos="2880"/>
+        </w:tabs>
+        <w:ind w:left="2880" w:hanging="360"/>
+      </w:pPr>
+      <w:rPr>
+        <w:rFonts w:ascii="Symbol" w:hAnsi="Symbol" w:hint="default"/>
+      </w:rPr>
+    </w:lvl>
+    <w:lvl w:ilvl="4">
+      <w:start w:val="1"/>
+      <w:numFmt w:val="bullet"/>
+      <w:lvlText w:val=""/>
+      <w:lvlJc w:val="left"/>
+      <w:pPr>
+        <w:tabs>
+          <w:tab w:val="num" w:pos="3600"/>
+        </w:tabs>
+        <w:ind w:left="3600" w:hanging="360"/>
+      </w:pPr>
+      <w:rPr>
+        <w:rFonts w:ascii="Symbol" w:hAnsi="Symbol" w:hint="default"/>
+      </w:rPr>
+    </w:lvl>
+    <w:lvl w:ilvl="5">
+      <w:start w:val="1"/>
+      <w:numFmt w:val="bullet"/>
+      <w:lvlText w:val=""/>
+      <w:lvlJc w:val="left"/>
+      <w:pPr>
+        <w:tabs>
+          <w:tab w:val="num" w:pos="4320"/>
+        </w:tabs>
+        <w:ind w:left="4320" w:hanging="360"/>
+      </w:pPr>
+      <w:rPr>
+        <w:rFonts w:ascii="Symbol" w:hAnsi="Symbol" w:hint="default"/>
+      </w:rPr>
+    </w:lvl>
+    <w:lvl w:ilvl="6">
+      <w:start w:val="1"/>
+      <w:numFmt w:val="bullet"/>
+      <w:lvlText w:val=""/>
+      <w:lvlJc w:val="left"/>
+      <w:pPr>
+        <w:tabs>
+          <w:tab w:val="num" w:pos="5040"/>
+        </w:tabs>
+        <w:ind w:left="5040" w:hanging="360"/>
+      </w:pPr>
+      <w:rPr>
+        <w:rFonts w:ascii="Symbol" w:hAnsi="Symbol" w:hint="default"/>
+      </w:rPr>
+    </w:lvl>
+    <w:lvl w:ilvl="7">
+      <w:start w:val="1"/>
+      <w:numFmt w:val="bullet"/>
+      <w:lvlText w:val=""/>
+      <w:lvlJc w:val="left"/>
+      <w:pPr>
+        <w:tabs>
+          <w:tab w:val="num" w:pos="5760"/>
+        </w:tabs>
+        <w:ind w:left="5760" w:hanging="360"/>
+      </w:pPr>
+      <w:rPr>
+        <w:rFonts w:ascii="Symbol" w:hAnsi="Symbol" w:hint="default"/>
+      </w:rPr>
+    </w:lvl>
+  </w:abstractNum>
+  <w:abstractNum w:abstractNumId="5">
+    <w:lvl w:ilvl="0">
+      <w:start w:val="1"/>
       <w:numFmt w:val="decimal"/>
       <w:lvlText w:val="%1."/>
       <w:lvlJc w:val="left"/>
@@ -4082,7 +5076,7 @@
       </w:pPr>
     </w:lvl>
   </w:abstractNum>
-  <w:abstractNum w:abstractNumId="5">
+  <w:abstractNum w:abstractNumId="6">
     <w:lvl w:ilvl="0">
       <w:start w:val="1"/>
       <w:numFmt w:val="bullet"/>
@@ -4218,6 +5212,9 @@
   </w:num>
   <w:num w:numId="5">
     <w:abstractNumId w:val="5"/>
+  </w:num>
+  <w:num w:numId="6">
+    <w:abstractNumId w:val="6"/>
   </w:num>
 </w:numbering>
 </file>

</xml_diff>